<commit_message>
Add product-management framing to CVs per CTO feedback
Highlight defining delivery process and engineering discipline (before
and after agentic AI tooling), and frame the Tech Lead role as embedding
hands-on with the team rather than managing from a distance. Applied
across both resume docx/PDF variants and the bilingual website.

Co-Authored-By: Claude Sonnet 5 <noreply@anthropic.com>
</commit_message>
<xml_diff>
--- a/docs/CV_Julian_Giovanelli_SoftwareEngineer.docx
+++ b/docs/CV_Julian_Giovanelli_SoftwareEngineer.docx
@@ -29,7 +29,7 @@
     </w:p>
     <w:p>
       <w:pPr>
-        <w:spacing w:after="40" w:before="40"/>
+        <w:spacing w:after="30" w:before="30"/>
       </w:pPr>
       <w:r>
         <w:rPr>
@@ -46,7 +46,7 @@
         <w:pBdr>
           <w:bottom w:val="single" w:color="BFBFBF" w:sz="6" w:space="4"/>
         </w:pBdr>
-        <w:spacing w:after="60"/>
+        <w:spacing w:after="45"/>
       </w:pPr>
       <w:r>
         <w:rPr>
@@ -105,7 +105,7 @@
         <w:pBdr>
           <w:bottom w:val="single" w:color="8FAADC" w:sz="8" w:space="2"/>
         </w:pBdr>
-        <w:spacing w:after="120" w:before="260"/>
+        <w:spacing w:after="90" w:before="200"/>
       </w:pPr>
       <w:r>
         <w:rPr>
@@ -121,16 +121,16 @@
     </w:p>
     <w:p>
       <w:pPr>
-        <w:spacing w:after="40" w:line="264"/>
-      </w:pPr>
-      <w:r>
-        <w:rPr>
-          <w:rFonts w:ascii="Calibri" w:cs="Calibri" w:eastAsia="Calibri" w:hAnsi="Calibri"/>
-          <w:color w:val="222222"/>
-          <w:sz w:val="21"/>
-          <w:szCs w:val="21"/>
-        </w:rPr>
-        <w:t>Full-stack software engineer with 9+ years building scalable, maintainable web applications — currently Tech Lead for ViiBE, Viirtue’s white-label quote-to-cash platform, and one of the top contributors to its 40+ microservice codebase. Rebuilt the billing engine now processing close to $1M in monthly recurring revenue across 3,000+ accounts, contributing to a $10M Series A. Deep experience across .NET, Angular and Node.js: designing billing, quoting, taxation and payment systems, integrating third-party and AI services, and operating event-driven, cloud-native microservices on GCP (GKE / Kubernetes). Works AI-first with agentic tools like Claude Code across the development lifecycle. Passionate about clean architecture, TDD and continuous learning.</w:t>
+        <w:spacing w:after="30" w:line="240"/>
+      </w:pPr>
+      <w:r>
+        <w:rPr>
+          <w:rFonts w:ascii="Calibri" w:cs="Calibri" w:eastAsia="Calibri" w:hAnsi="Calibri"/>
+          <w:color w:val="222222"/>
+          <w:sz w:val="20"/>
+          <w:szCs w:val="20"/>
+        </w:rPr>
+        <w:t>Full-stack software engineer with 9+ years building scalable, maintainable web applications — currently Tech Lead for ViiBE, Viirtue’s white-label quote-to-cash platform, embedding directly with the team as a hands-on contributor while also owning the product side of delivery: defining requirements, process and quality discipline, and evolving that process through the shift to agentic AI-assisted development. One of the top contributors to its 40+ microservice codebase, having rebuilt the billing engine now processing close to $1M in monthly recurring revenue across 3,000+ accounts, contributing to a $10M Series A. Deep experience across .NET, Angular and Node.js: designing billing, quoting, taxation and payment systems, integrating third-party and AI services, and operating event-driven, cloud-native microservices on GCP (GKE / Kubernetes). Works AI-first with agentic tools like Claude Code across the development lifecycle. Passionate about clean architecture, TDD and continuous learning.</w:t>
       </w:r>
     </w:p>
     <w:p>
@@ -138,7 +138,7 @@
         <w:pBdr>
           <w:bottom w:val="single" w:color="8FAADC" w:sz="8" w:space="2"/>
         </w:pBdr>
-        <w:spacing w:after="120" w:before="260"/>
+        <w:spacing w:after="90" w:before="200"/>
       </w:pPr>
       <w:r>
         <w:rPr>
@@ -157,16 +157,16 @@
         <w:tabs>
           <w:tab w:val="right" w:pos="10080"/>
         </w:tabs>
-        <w:spacing w:after="20" w:before="180"/>
-      </w:pPr>
-      <w:r>
-        <w:rPr>
-          <w:rFonts w:ascii="Calibri" w:cs="Calibri" w:eastAsia="Calibri" w:hAnsi="Calibri"/>
-          <w:b/>
-          <w:bCs/>
-          <w:color w:val="222222"/>
-          <w:sz w:val="23"/>
-          <w:szCs w:val="23"/>
+        <w:spacing w:after="10" w:before="140"/>
+      </w:pPr>
+      <w:r>
+        <w:rPr>
+          <w:rFonts w:ascii="Calibri" w:cs="Calibri" w:eastAsia="Calibri" w:hAnsi="Calibri"/>
+          <w:b/>
+          <w:bCs/>
+          <w:color w:val="222222"/>
+          <w:sz w:val="22"/>
+          <w:szCs w:val="22"/>
         </w:rPr>
         <w:t xml:space="preserve">Software Engineer</w:t>
       </w:r>
@@ -174,8 +174,8 @@
         <w:rPr>
           <w:rFonts w:ascii="Calibri" w:cs="Calibri" w:eastAsia="Calibri" w:hAnsi="Calibri"/>
           <w:color w:val="595959"/>
-          <w:sz w:val="23"/>
-          <w:szCs w:val="23"/>
+          <w:sz w:val="22"/>
+          <w:szCs w:val="22"/>
         </w:rPr>
         <w:t xml:space="preserve">  ·  </w:t>
       </w:r>
@@ -185,8 +185,8 @@
           <w:b/>
           <w:bCs/>
           <w:color w:val="1F3864"/>
-          <w:sz w:val="23"/>
-          <w:szCs w:val="23"/>
+          <w:sz w:val="22"/>
+          <w:szCs w:val="22"/>
         </w:rPr>
         <w:t xml:space="preserve">Viirtue</w:t>
       </w:r>
@@ -209,14 +209,14 @@
           <w:ilvl w:val="0"/>
           <w:numId w:val="2"/>
         </w:numPr>
-        <w:spacing w:after="40" w:line="264"/>
-      </w:pPr>
-      <w:r>
-        <w:rPr>
-          <w:rFonts w:ascii="Calibri" w:cs="Calibri" w:eastAsia="Calibri" w:hAnsi="Calibri"/>
-          <w:color w:val="222222"/>
-          <w:sz w:val="21"/>
-          <w:szCs w:val="21"/>
+        <w:spacing w:after="30" w:line="240"/>
+      </w:pPr>
+      <w:r>
+        <w:rPr>
+          <w:rFonts w:ascii="Calibri" w:cs="Calibri" w:eastAsia="Calibri" w:hAnsi="Calibri"/>
+          <w:color w:val="222222"/>
+          <w:sz w:val="20"/>
+          <w:szCs w:val="20"/>
         </w:rPr>
         <w:t>Built an end-customer portal that lets customers stay up to date with their bills and payments in real time, integrating Stripe and Authorize.Net through saga-based, event-driven payment processing (MassTransit / RabbitMQ) and reducing inbound billing-support requests; adopted by 180+ partners (~65% of the partner base).</w:t>
       </w:r>
@@ -228,14 +228,14 @@
           <w:ilvl w:val="0"/>
           <w:numId w:val="2"/>
         </w:numPr>
-        <w:spacing w:after="40" w:line="264"/>
-      </w:pPr>
-      <w:r>
-        <w:rPr>
-          <w:rFonts w:ascii="Calibri" w:cs="Calibri" w:eastAsia="Calibri" w:hAnsi="Calibri"/>
-          <w:color w:val="222222"/>
-          <w:sz w:val="21"/>
-          <w:szCs w:val="21"/>
+        <w:spacing w:after="30" w:line="240"/>
+      </w:pPr>
+      <w:r>
+        <w:rPr>
+          <w:rFonts w:ascii="Calibri" w:cs="Calibri" w:eastAsia="Calibri" w:hAnsi="Calibri"/>
+          <w:color w:val="222222"/>
+          <w:sz w:val="20"/>
+          <w:szCs w:val="20"/>
         </w:rPr>
         <w:t xml:space="preserve">Rebuilt the billing system from the ground up, powering automated monthly invoicing for 3,000+ end-customer accounts and enabling partners to bill close to $1M in monthly recurring revenue.</w:t>
       </w:r>
@@ -247,14 +247,14 @@
           <w:ilvl w:val="0"/>
           <w:numId w:val="2"/>
         </w:numPr>
-        <w:spacing w:after="40" w:line="264"/>
-      </w:pPr>
-      <w:r>
-        <w:rPr>
-          <w:rFonts w:ascii="Calibri" w:cs="Calibri" w:eastAsia="Calibri" w:hAnsi="Calibri"/>
-          <w:color w:val="222222"/>
-          <w:sz w:val="21"/>
-          <w:szCs w:val="21"/>
+        <w:spacing w:after="30" w:line="240"/>
+      </w:pPr>
+      <w:r>
+        <w:rPr>
+          <w:rFonts w:ascii="Calibri" w:cs="Calibri" w:eastAsia="Calibri" w:hAnsi="Calibri"/>
+          <w:color w:val="222222"/>
+          <w:sz w:val="20"/>
+          <w:szCs w:val="20"/>
         </w:rPr>
         <w:t xml:space="preserve">Rebuilt the quoting system, adding customer e-signature support to let customers sign quotes online and shortening the quote-to-close cycle.</w:t>
       </w:r>
@@ -266,14 +266,14 @@
           <w:ilvl w:val="0"/>
           <w:numId w:val="2"/>
         </w:numPr>
-        <w:spacing w:after="40" w:line="264"/>
-      </w:pPr>
-      <w:r>
-        <w:rPr>
-          <w:rFonts w:ascii="Calibri" w:cs="Calibri" w:eastAsia="Calibri" w:hAnsi="Calibri"/>
-          <w:color w:val="222222"/>
-          <w:sz w:val="21"/>
-          <w:szCs w:val="21"/>
+        <w:spacing w:after="30" w:line="240"/>
+      </w:pPr>
+      <w:r>
+        <w:rPr>
+          <w:rFonts w:ascii="Calibri" w:cs="Calibri" w:eastAsia="Calibri" w:hAnsi="Calibri"/>
+          <w:color w:val="222222"/>
+          <w:sz w:val="20"/>
+          <w:szCs w:val="20"/>
         </w:rPr>
         <w:t>Designed and delivered the AI voice agent product line end to end — quoting, per-call usage metering, cost calculation and automated billing for AI-powered calls — opening a new usage-based revenue stream.</w:t>
       </w:r>
@@ -285,14 +285,14 @@
           <w:ilvl w:val="0"/>
           <w:numId w:val="2"/>
         </w:numPr>
-        <w:spacing w:after="40" w:line="264"/>
-      </w:pPr>
-      <w:r>
-        <w:rPr>
-          <w:rFonts w:ascii="Calibri" w:cs="Calibri" w:eastAsia="Calibri" w:hAnsi="Calibri"/>
-          <w:color w:val="222222"/>
-          <w:sz w:val="21"/>
-          <w:szCs w:val="21"/>
+        <w:spacing w:after="30" w:line="240"/>
+      </w:pPr>
+      <w:r>
+        <w:rPr>
+          <w:rFonts w:ascii="Calibri" w:cs="Calibri" w:eastAsia="Calibri" w:hAnsi="Calibri"/>
+          <w:color w:val="222222"/>
+          <w:sz w:val="20"/>
+          <w:szCs w:val="20"/>
         </w:rPr>
         <w:t xml:space="preserve">Implemented an automated customer notification system, emailing customers about invoice statuses and payment confirmations to reduce manual follow-up.</w:t>
       </w:r>
@@ -304,14 +304,14 @@
           <w:ilvl w:val="0"/>
           <w:numId w:val="2"/>
         </w:numPr>
-        <w:spacing w:after="40" w:line="264"/>
-      </w:pPr>
-      <w:r>
-        <w:rPr>
-          <w:rFonts w:ascii="Calibri" w:cs="Calibri" w:eastAsia="Calibri" w:hAnsi="Calibri"/>
-          <w:color w:val="222222"/>
-          <w:sz w:val="21"/>
-          <w:szCs w:val="21"/>
+        <w:spacing w:after="30" w:line="240"/>
+      </w:pPr>
+      <w:r>
+        <w:rPr>
+          <w:rFonts w:ascii="Calibri" w:cs="Calibri" w:eastAsia="Calibri" w:hAnsi="Calibri"/>
+          <w:color w:val="222222"/>
+          <w:sz w:val="20"/>
+          <w:szCs w:val="20"/>
         </w:rPr>
         <w:t xml:space="preserve">Built an integration with Rev.io and implemented document storage on Microsoft Azure to extend the platform’s billing and storage capabilities.</w:t>
       </w:r>
@@ -323,14 +323,14 @@
           <w:ilvl w:val="0"/>
           <w:numId w:val="2"/>
         </w:numPr>
-        <w:spacing w:after="40" w:line="264"/>
-      </w:pPr>
-      <w:r>
-        <w:rPr>
-          <w:rFonts w:ascii="Calibri" w:cs="Calibri" w:eastAsia="Calibri" w:hAnsi="Calibri"/>
-          <w:color w:val="222222"/>
-          <w:sz w:val="21"/>
-          <w:szCs w:val="21"/>
+        <w:spacing w:after="30" w:line="240"/>
+      </w:pPr>
+      <w:r>
+        <w:rPr>
+          <w:rFonts w:ascii="Calibri" w:cs="Calibri" w:eastAsia="Calibri" w:hAnsi="Calibri"/>
+          <w:color w:val="222222"/>
+          <w:sz w:val="20"/>
+          <w:szCs w:val="20"/>
         </w:rPr>
         <w:t xml:space="preserve">Refactored the entire reporting system into a more robust, standardized and functional solution, improving reliability and consistency across revenue, usage and accounts-receivable reports.</w:t>
       </w:r>
@@ -342,14 +342,14 @@
           <w:ilvl w:val="0"/>
           <w:numId w:val="2"/>
         </w:numPr>
-        <w:spacing w:after="40" w:line="264"/>
-      </w:pPr>
-      <w:r>
-        <w:rPr>
-          <w:rFonts w:ascii="Calibri" w:cs="Calibri" w:eastAsia="Calibri" w:hAnsi="Calibri"/>
-          <w:color w:val="222222"/>
-          <w:sz w:val="21"/>
-          <w:szCs w:val="21"/>
+        <w:spacing w:after="30" w:line="240"/>
+      </w:pPr>
+      <w:r>
+        <w:rPr>
+          <w:rFonts w:ascii="Calibri" w:cs="Calibri" w:eastAsia="Calibri" w:hAnsi="Calibri"/>
+          <w:color w:val="222222"/>
+          <w:sz w:val="20"/>
+          <w:szCs w:val="20"/>
         </w:rPr>
         <w:t>Maintained and operated a fleet of 40+ cloud-native .NET and Angular microservices on Google Cloud Platform, containerized and deployed to Kubernetes (GKE) with Helm and Istio through a GitOps CI/CD pipeline, working within an Nx monorepo and applying TDD for maintainable, well-tested and reliably deployable code.</w:t>
       </w:r>
@@ -361,16 +361,16 @@
           <w:ilvl w:val="0"/>
           <w:numId w:val="2"/>
         </w:numPr>
-        <w:spacing w:after="40" w:line="264"/>
-      </w:pPr>
-      <w:r>
-        <w:rPr>
-          <w:rFonts w:ascii="Calibri" w:cs="Calibri" w:eastAsia="Calibri" w:hAnsi="Calibri"/>
-          <w:color w:val="222222"/>
-          <w:sz w:val="21"/>
-          <w:szCs w:val="21"/>
-        </w:rPr>
-        <w:t xml:space="preserve">As Tech Lead (since Nov 2023), led a cross-functional team of up to 12 engineers and mentored teammates while continuing to contribute hands-on across the platform.</w:t>
+        <w:spacing w:after="30" w:line="240"/>
+      </w:pPr>
+      <w:r>
+        <w:rPr>
+          <w:rFonts w:ascii="Calibri" w:cs="Calibri" w:eastAsia="Calibri" w:hAnsi="Calibri"/>
+          <w:color w:val="222222"/>
+          <w:sz w:val="20"/>
+          <w:szCs w:val="20"/>
+        </w:rPr>
+        <w:t>As Tech Lead (since Nov 2023), led a cross-functional team of up to 12 engineers, defining the team’s delivery process and quality discipline — and adapting it for agentic AI-assisted workflows — while mentoring teammates and continuing to contribute hands-on across the platform.</w:t>
       </w:r>
     </w:p>
     <w:p>
@@ -378,16 +378,16 @@
         <w:tabs>
           <w:tab w:val="right" w:pos="10080"/>
         </w:tabs>
-        <w:spacing w:after="20" w:before="180"/>
-      </w:pPr>
-      <w:r>
-        <w:rPr>
-          <w:rFonts w:ascii="Calibri" w:cs="Calibri" w:eastAsia="Calibri" w:hAnsi="Calibri"/>
-          <w:b/>
-          <w:bCs/>
-          <w:color w:val="222222"/>
-          <w:sz w:val="23"/>
-          <w:szCs w:val="23"/>
+        <w:spacing w:after="10" w:before="140"/>
+      </w:pPr>
+      <w:r>
+        <w:rPr>
+          <w:rFonts w:ascii="Calibri" w:cs="Calibri" w:eastAsia="Calibri" w:hAnsi="Calibri"/>
+          <w:b/>
+          <w:bCs/>
+          <w:color w:val="222222"/>
+          <w:sz w:val="22"/>
+          <w:szCs w:val="22"/>
         </w:rPr>
         <w:t xml:space="preserve">Software Engineer</w:t>
       </w:r>
@@ -395,8 +395,8 @@
         <w:rPr>
           <w:rFonts w:ascii="Calibri" w:cs="Calibri" w:eastAsia="Calibri" w:hAnsi="Calibri"/>
           <w:color w:val="595959"/>
-          <w:sz w:val="23"/>
-          <w:szCs w:val="23"/>
+          <w:sz w:val="22"/>
+          <w:szCs w:val="22"/>
         </w:rPr>
         <w:t xml:space="preserve">  ·  </w:t>
       </w:r>
@@ -406,8 +406,8 @@
           <w:b/>
           <w:bCs/>
           <w:color w:val="1F3864"/>
-          <w:sz w:val="23"/>
-          <w:szCs w:val="23"/>
+          <w:sz w:val="22"/>
+          <w:szCs w:val="22"/>
         </w:rPr>
         <w:t xml:space="preserve">Inamika</w:t>
       </w:r>
@@ -430,14 +430,14 @@
           <w:ilvl w:val="0"/>
           <w:numId w:val="2"/>
         </w:numPr>
-        <w:spacing w:after="40" w:line="264"/>
-      </w:pPr>
-      <w:r>
-        <w:rPr>
-          <w:rFonts w:ascii="Calibri" w:cs="Calibri" w:eastAsia="Calibri" w:hAnsi="Calibri"/>
-          <w:color w:val="222222"/>
-          <w:sz w:val="21"/>
-          <w:szCs w:val="21"/>
+        <w:spacing w:after="30" w:line="240"/>
+      </w:pPr>
+      <w:r>
+        <w:rPr>
+          <w:rFonts w:ascii="Calibri" w:cs="Calibri" w:eastAsia="Calibri" w:hAnsi="Calibri"/>
+          <w:color w:val="222222"/>
+          <w:sz w:val="20"/>
+          <w:szCs w:val="20"/>
         </w:rPr>
         <w:t xml:space="preserve">Worked on an incremental web application using ASP.NET Core, ABP, MySQL and Angular to manage orders from different sources of sale.</w:t>
       </w:r>
@@ -449,14 +449,14 @@
           <w:ilvl w:val="0"/>
           <w:numId w:val="2"/>
         </w:numPr>
-        <w:spacing w:after="40" w:line="264"/>
-      </w:pPr>
-      <w:r>
-        <w:rPr>
-          <w:rFonts w:ascii="Calibri" w:cs="Calibri" w:eastAsia="Calibri" w:hAnsi="Calibri"/>
-          <w:color w:val="222222"/>
-          <w:sz w:val="21"/>
-          <w:szCs w:val="21"/>
+        <w:spacing w:after="30" w:line="240"/>
+      </w:pPr>
+      <w:r>
+        <w:rPr>
+          <w:rFonts w:ascii="Calibri" w:cs="Calibri" w:eastAsia="Calibri" w:hAnsi="Calibri"/>
+          <w:color w:val="222222"/>
+          <w:sz w:val="20"/>
+          <w:szCs w:val="20"/>
         </w:rPr>
         <w:t xml:space="preserve">Developed a web application using ASP.NET Core, ABP, MySQL and Angular to measure company progress and growth.</w:t>
       </w:r>
@@ -468,14 +468,14 @@
           <w:ilvl w:val="0"/>
           <w:numId w:val="2"/>
         </w:numPr>
-        <w:spacing w:after="40" w:line="264"/>
-      </w:pPr>
-      <w:r>
-        <w:rPr>
-          <w:rFonts w:ascii="Calibri" w:cs="Calibri" w:eastAsia="Calibri" w:hAnsi="Calibri"/>
-          <w:color w:val="222222"/>
-          <w:sz w:val="21"/>
-          <w:szCs w:val="21"/>
+        <w:spacing w:after="30" w:line="240"/>
+      </w:pPr>
+      <w:r>
+        <w:rPr>
+          <w:rFonts w:ascii="Calibri" w:cs="Calibri" w:eastAsia="Calibri" w:hAnsi="Calibri"/>
+          <w:color w:val="222222"/>
+          <w:sz w:val="20"/>
+          <w:szCs w:val="20"/>
         </w:rPr>
         <w:t xml:space="preserve">Helped improve infrastructure by implementing AWS services such as Lambda, EC2 and CloudTrail.</w:t>
       </w:r>
@@ -485,16 +485,16 @@
         <w:tabs>
           <w:tab w:val="right" w:pos="10080"/>
         </w:tabs>
-        <w:spacing w:after="20" w:before="180"/>
-      </w:pPr>
-      <w:r>
-        <w:rPr>
-          <w:rFonts w:ascii="Calibri" w:cs="Calibri" w:eastAsia="Calibri" w:hAnsi="Calibri"/>
-          <w:b/>
-          <w:bCs/>
-          <w:color w:val="222222"/>
-          <w:sz w:val="23"/>
-          <w:szCs w:val="23"/>
+        <w:spacing w:after="10" w:before="140"/>
+      </w:pPr>
+      <w:r>
+        <w:rPr>
+          <w:rFonts w:ascii="Calibri" w:cs="Calibri" w:eastAsia="Calibri" w:hAnsi="Calibri"/>
+          <w:b/>
+          <w:bCs/>
+          <w:color w:val="222222"/>
+          <w:sz w:val="22"/>
+          <w:szCs w:val="22"/>
         </w:rPr>
         <w:t xml:space="preserve">Software Engineer</w:t>
       </w:r>
@@ -502,8 +502,8 @@
         <w:rPr>
           <w:rFonts w:ascii="Calibri" w:cs="Calibri" w:eastAsia="Calibri" w:hAnsi="Calibri"/>
           <w:color w:val="595959"/>
-          <w:sz w:val="23"/>
-          <w:szCs w:val="23"/>
+          <w:sz w:val="22"/>
+          <w:szCs w:val="22"/>
         </w:rPr>
         <w:t xml:space="preserve">  ·  </w:t>
       </w:r>
@@ -513,8 +513,8 @@
           <w:b/>
           <w:bCs/>
           <w:color w:val="1F3864"/>
-          <w:sz w:val="23"/>
-          <w:szCs w:val="23"/>
+          <w:sz w:val="22"/>
+          <w:szCs w:val="22"/>
         </w:rPr>
         <w:t xml:space="preserve">WB Sistemas SRL</w:t>
       </w:r>
@@ -537,14 +537,14 @@
           <w:ilvl w:val="0"/>
           <w:numId w:val="2"/>
         </w:numPr>
-        <w:spacing w:after="40" w:line="264"/>
-      </w:pPr>
-      <w:r>
-        <w:rPr>
-          <w:rFonts w:ascii="Calibri" w:cs="Calibri" w:eastAsia="Calibri" w:hAnsi="Calibri"/>
-          <w:color w:val="222222"/>
-          <w:sz w:val="21"/>
-          <w:szCs w:val="21"/>
+        <w:spacing w:after="30" w:line="240"/>
+      </w:pPr>
+      <w:r>
+        <w:rPr>
+          <w:rFonts w:ascii="Calibri" w:cs="Calibri" w:eastAsia="Calibri" w:hAnsi="Calibri"/>
+          <w:color w:val="222222"/>
+          <w:sz w:val="20"/>
+          <w:szCs w:val="20"/>
         </w:rPr>
         <w:t xml:space="preserve">Introduced Scrum methodology in the company and acted as team leader for newcomer projects.</w:t>
       </w:r>
@@ -556,14 +556,14 @@
           <w:ilvl w:val="0"/>
           <w:numId w:val="2"/>
         </w:numPr>
-        <w:spacing w:after="40" w:line="264"/>
-      </w:pPr>
-      <w:r>
-        <w:rPr>
-          <w:rFonts w:ascii="Calibri" w:cs="Calibri" w:eastAsia="Calibri" w:hAnsi="Calibri"/>
-          <w:color w:val="222222"/>
-          <w:sz w:val="21"/>
-          <w:szCs w:val="21"/>
+        <w:spacing w:after="30" w:line="240"/>
+      </w:pPr>
+      <w:r>
+        <w:rPr>
+          <w:rFonts w:ascii="Calibri" w:cs="Calibri" w:eastAsia="Calibri" w:hAnsi="Calibri"/>
+          <w:color w:val="222222"/>
+          <w:sz w:val="20"/>
+          <w:szCs w:val="20"/>
         </w:rPr>
         <w:t xml:space="preserve">Managed and developed ASP.NET MVC applications applying SOLID principles, Entity Framework and Angular for maintainable, scalable and testable software.</w:t>
       </w:r>
@@ -575,14 +575,14 @@
           <w:ilvl w:val="0"/>
           <w:numId w:val="2"/>
         </w:numPr>
-        <w:spacing w:after="40" w:line="264"/>
-      </w:pPr>
-      <w:r>
-        <w:rPr>
-          <w:rFonts w:ascii="Calibri" w:cs="Calibri" w:eastAsia="Calibri" w:hAnsi="Calibri"/>
-          <w:color w:val="222222"/>
-          <w:sz w:val="21"/>
-          <w:szCs w:val="21"/>
+        <w:spacing w:after="30" w:line="240"/>
+      </w:pPr>
+      <w:r>
+        <w:rPr>
+          <w:rFonts w:ascii="Calibri" w:cs="Calibri" w:eastAsia="Calibri" w:hAnsi="Calibri"/>
+          <w:color w:val="222222"/>
+          <w:sz w:val="20"/>
+          <w:szCs w:val="20"/>
         </w:rPr>
         <w:t xml:space="preserve">Built a bus-ticket selling platform for “RosarioBus” using ASP.NET MVC, Entity Framework, Angular, TDD and Scrum.</w:t>
       </w:r>
@@ -594,14 +594,14 @@
           <w:ilvl w:val="0"/>
           <w:numId w:val="2"/>
         </w:numPr>
-        <w:spacing w:after="40" w:line="264"/>
-      </w:pPr>
-      <w:r>
-        <w:rPr>
-          <w:rFonts w:ascii="Calibri" w:cs="Calibri" w:eastAsia="Calibri" w:hAnsi="Calibri"/>
-          <w:color w:val="222222"/>
-          <w:sz w:val="21"/>
-          <w:szCs w:val="21"/>
+        <w:spacing w:after="30" w:line="240"/>
+      </w:pPr>
+      <w:r>
+        <w:rPr>
+          <w:rFonts w:ascii="Calibri" w:cs="Calibri" w:eastAsia="Calibri" w:hAnsi="Calibri"/>
+          <w:color w:val="222222"/>
+          <w:sz w:val="20"/>
+          <w:szCs w:val="20"/>
         </w:rPr>
         <w:t xml:space="preserve">Developed an e-learning platform for “Fray Luis Beltrán” training centers using ASP.NET Core MVC, Entity Framework, Angular, TDD and Scrum.</w:t>
       </w:r>
@@ -613,14 +613,14 @@
           <w:ilvl w:val="0"/>
           <w:numId w:val="2"/>
         </w:numPr>
-        <w:spacing w:after="40" w:line="264"/>
-      </w:pPr>
-      <w:r>
-        <w:rPr>
-          <w:rFonts w:ascii="Calibri" w:cs="Calibri" w:eastAsia="Calibri" w:hAnsi="Calibri"/>
-          <w:color w:val="222222"/>
-          <w:sz w:val="21"/>
-          <w:szCs w:val="21"/>
+        <w:spacing w:after="30" w:line="240"/>
+      </w:pPr>
+      <w:r>
+        <w:rPr>
+          <w:rFonts w:ascii="Calibri" w:cs="Calibri" w:eastAsia="Calibri" w:hAnsi="Calibri"/>
+          <w:color w:val="222222"/>
+          <w:sz w:val="20"/>
+          <w:szCs w:val="20"/>
         </w:rPr>
         <w:t xml:space="preserve">Built an e-commerce platform for “Wienner” and “Metrolab” to buy and sell blood-test machines and equipment, using ASP.NET Core MVC, Entity Framework, Angular, TDD and IdentityServer.</w:t>
       </w:r>
@@ -630,7 +630,7 @@
         <w:pBdr>
           <w:bottom w:val="single" w:color="8FAADC" w:sz="8" w:space="2"/>
         </w:pBdr>
-        <w:spacing w:after="120" w:before="260"/>
+        <w:spacing w:after="90" w:before="200"/>
       </w:pPr>
       <w:r>
         <w:rPr>
@@ -646,16 +646,16 @@
     </w:p>
     <w:p>
       <w:pPr>
-        <w:spacing w:after="60" w:line="264"/>
-      </w:pPr>
-      <w:r>
-        <w:rPr>
-          <w:rFonts w:ascii="Calibri" w:cs="Calibri" w:eastAsia="Calibri" w:hAnsi="Calibri"/>
-          <w:b/>
-          <w:bCs/>
-          <w:color w:val="1F3864"/>
-          <w:sz w:val="21"/>
-          <w:szCs w:val="21"/>
+        <w:spacing w:after="45" w:line="240"/>
+      </w:pPr>
+      <w:r>
+        <w:rPr>
+          <w:rFonts w:ascii="Calibri" w:cs="Calibri" w:eastAsia="Calibri" w:hAnsi="Calibri"/>
+          <w:b/>
+          <w:bCs/>
+          <w:color w:val="1F3864"/>
+          <w:sz w:val="20"/>
+          <w:szCs w:val="20"/>
         </w:rPr>
         <w:t xml:space="preserve">Languages:  </w:t>
       </w:r>
@@ -663,24 +663,24 @@
         <w:rPr>
           <w:rFonts w:ascii="Calibri" w:cs="Calibri" w:eastAsia="Calibri" w:hAnsi="Calibri"/>
           <w:color w:val="222222"/>
-          <w:sz w:val="21"/>
-          <w:szCs w:val="21"/>
+          <w:sz w:val="20"/>
+          <w:szCs w:val="20"/>
         </w:rPr>
         <w:t xml:space="preserve">C#, JavaScript, TypeScript, Java, SQL</w:t>
       </w:r>
     </w:p>
     <w:p>
       <w:pPr>
-        <w:spacing w:after="60" w:line="264"/>
-      </w:pPr>
-      <w:r>
-        <w:rPr>
-          <w:rFonts w:ascii="Calibri" w:cs="Calibri" w:eastAsia="Calibri" w:hAnsi="Calibri"/>
-          <w:b/>
-          <w:bCs/>
-          <w:color w:val="1F3864"/>
-          <w:sz w:val="21"/>
-          <w:szCs w:val="21"/>
+        <w:spacing w:after="45" w:line="240"/>
+      </w:pPr>
+      <w:r>
+        <w:rPr>
+          <w:rFonts w:ascii="Calibri" w:cs="Calibri" w:eastAsia="Calibri" w:hAnsi="Calibri"/>
+          <w:b/>
+          <w:bCs/>
+          <w:color w:val="1F3864"/>
+          <w:sz w:val="20"/>
+          <w:szCs w:val="20"/>
         </w:rPr>
         <w:t xml:space="preserve">Backend:  </w:t>
       </w:r>
@@ -688,24 +688,24 @@
         <w:rPr>
           <w:rFonts w:ascii="Calibri" w:cs="Calibri" w:eastAsia="Calibri" w:hAnsi="Calibri"/>
           <w:color w:val="222222"/>
-          <w:sz w:val="21"/>
-          <w:szCs w:val="21"/>
+          <w:sz w:val="20"/>
+          <w:szCs w:val="20"/>
         </w:rPr>
         <w:t>.NET / ASP.NET Core, Entity Framework Core, Dapper, MediatR, MassTransit / RabbitMQ, gRPC, Node.js, ABP, Spring/Hibernate</w:t>
       </w:r>
     </w:p>
     <w:p>
       <w:pPr>
-        <w:spacing w:after="60" w:line="264"/>
-      </w:pPr>
-      <w:r>
-        <w:rPr>
-          <w:rFonts w:ascii="Calibri" w:cs="Calibri" w:eastAsia="Calibri" w:hAnsi="Calibri"/>
-          <w:b/>
-          <w:bCs/>
-          <w:color w:val="1F3864"/>
-          <w:sz w:val="21"/>
-          <w:szCs w:val="21"/>
+        <w:spacing w:after="45" w:line="240"/>
+      </w:pPr>
+      <w:r>
+        <w:rPr>
+          <w:rFonts w:ascii="Calibri" w:cs="Calibri" w:eastAsia="Calibri" w:hAnsi="Calibri"/>
+          <w:b/>
+          <w:bCs/>
+          <w:color w:val="1F3864"/>
+          <w:sz w:val="20"/>
+          <w:szCs w:val="20"/>
         </w:rPr>
         <w:t xml:space="preserve">Frontend:  </w:t>
       </w:r>
@@ -713,24 +713,24 @@
         <w:rPr>
           <w:rFonts w:ascii="Calibri" w:cs="Calibri" w:eastAsia="Calibri" w:hAnsi="Calibri"/>
           <w:color w:val="222222"/>
-          <w:sz w:val="21"/>
-          <w:szCs w:val="21"/>
+          <w:sz w:val="20"/>
+          <w:szCs w:val="20"/>
         </w:rPr>
         <w:t>Angular, NgRx, Tailwind CSS, Ionic, AngularJS, jQuery</w:t>
       </w:r>
     </w:p>
     <w:p>
       <w:pPr>
-        <w:spacing w:after="60" w:line="264"/>
-      </w:pPr>
-      <w:r>
-        <w:rPr>
-          <w:rFonts w:ascii="Calibri" w:cs="Calibri" w:eastAsia="Calibri" w:hAnsi="Calibri"/>
-          <w:b/>
-          <w:bCs/>
-          <w:color w:val="1F3864"/>
-          <w:sz w:val="21"/>
-          <w:szCs w:val="21"/>
+        <w:spacing w:after="45" w:line="240"/>
+      </w:pPr>
+      <w:r>
+        <w:rPr>
+          <w:rFonts w:ascii="Calibri" w:cs="Calibri" w:eastAsia="Calibri" w:hAnsi="Calibri"/>
+          <w:b/>
+          <w:bCs/>
+          <w:color w:val="1F3864"/>
+          <w:sz w:val="20"/>
+          <w:szCs w:val="20"/>
         </w:rPr>
         <w:t xml:space="preserve">Data:  </w:t>
       </w:r>
@@ -738,24 +738,24 @@
         <w:rPr>
           <w:rFonts w:ascii="Calibri" w:cs="Calibri" w:eastAsia="Calibri" w:hAnsi="Calibri"/>
           <w:color w:val="222222"/>
-          <w:sz w:val="21"/>
-          <w:szCs w:val="21"/>
+          <w:sz w:val="20"/>
+          <w:szCs w:val="20"/>
         </w:rPr>
         <w:t>PostgreSQL, MySQL, SQL Server, BigQuery, Firebase</w:t>
       </w:r>
     </w:p>
     <w:p>
       <w:pPr>
-        <w:spacing w:after="60" w:line="264"/>
-      </w:pPr>
-      <w:r>
-        <w:rPr>
-          <w:rFonts w:ascii="Calibri" w:cs="Calibri" w:eastAsia="Calibri" w:hAnsi="Calibri"/>
-          <w:b/>
-          <w:bCs/>
-          <w:color w:val="1F3864"/>
-          <w:sz w:val="21"/>
-          <w:szCs w:val="21"/>
+        <w:spacing w:after="45" w:line="240"/>
+      </w:pPr>
+      <w:r>
+        <w:rPr>
+          <w:rFonts w:ascii="Calibri" w:cs="Calibri" w:eastAsia="Calibri" w:hAnsi="Calibri"/>
+          <w:b/>
+          <w:bCs/>
+          <w:color w:val="1F3864"/>
+          <w:sz w:val="20"/>
+          <w:szCs w:val="20"/>
         </w:rPr>
         <w:t xml:space="preserve">Cloud &amp; platform operations:  </w:t>
       </w:r>
@@ -763,24 +763,24 @@
         <w:rPr>
           <w:rFonts w:ascii="Calibri" w:cs="Calibri" w:eastAsia="Calibri" w:hAnsi="Calibri"/>
           <w:color w:val="222222"/>
-          <w:sz w:val="21"/>
-          <w:szCs w:val="21"/>
+          <w:sz w:val="20"/>
+          <w:szCs w:val="20"/>
         </w:rPr>
         <w:t>Google Cloud Platform (GKE), Kubernetes, Helm, Docker, CI/CD (GoCD, Argo CD / GitOps), AWS (Lambda, EC2, CloudTrail), Microsoft Azure</w:t>
       </w:r>
     </w:p>
     <w:p>
       <w:pPr>
-        <w:spacing w:after="60" w:line="264"/>
-      </w:pPr>
-      <w:r>
-        <w:rPr>
-          <w:rFonts w:ascii="Calibri" w:cs="Calibri" w:eastAsia="Calibri" w:hAnsi="Calibri"/>
-          <w:b/>
-          <w:bCs/>
-          <w:color w:val="1F3864"/>
-          <w:sz w:val="21"/>
-          <w:szCs w:val="21"/>
+        <w:spacing w:after="45" w:line="240"/>
+      </w:pPr>
+      <w:r>
+        <w:rPr>
+          <w:rFonts w:ascii="Calibri" w:cs="Calibri" w:eastAsia="Calibri" w:hAnsi="Calibri"/>
+          <w:b/>
+          <w:bCs/>
+          <w:color w:val="1F3864"/>
+          <w:sz w:val="20"/>
+          <w:szCs w:val="20"/>
         </w:rPr>
         <w:t xml:space="preserve">Integrations:  </w:t>
       </w:r>
@@ -788,24 +788,24 @@
         <w:rPr>
           <w:rFonts w:ascii="Calibri" w:cs="Calibri" w:eastAsia="Calibri" w:hAnsi="Calibri"/>
           <w:color w:val="222222"/>
-          <w:sz w:val="21"/>
-          <w:szCs w:val="21"/>
+          <w:sz w:val="20"/>
+          <w:szCs w:val="20"/>
         </w:rPr>
         <w:t>Stripe, Authorize.Net, Rev.io, QuickBooks, ConnectWise, NetSapiens (UCaaS), tax engines (CSI / SureTax), AI voice agents, Keycloak / IdentityServer (SSO), LaunchDarkly / OpenFeature</w:t>
       </w:r>
     </w:p>
     <w:p>
       <w:pPr>
-        <w:spacing w:after="60" w:line="264"/>
-      </w:pPr>
-      <w:r>
-        <w:rPr>
-          <w:rFonts w:ascii="Calibri" w:cs="Calibri" w:eastAsia="Calibri" w:hAnsi="Calibri"/>
-          <w:b/>
-          <w:bCs/>
-          <w:color w:val="1F3864"/>
-          <w:sz w:val="21"/>
-          <w:szCs w:val="21"/>
+        <w:spacing w:after="45" w:line="240"/>
+      </w:pPr>
+      <w:r>
+        <w:rPr>
+          <w:rFonts w:ascii="Calibri" w:cs="Calibri" w:eastAsia="Calibri" w:hAnsi="Calibri"/>
+          <w:b/>
+          <w:bCs/>
+          <w:color w:val="1F3864"/>
+          <w:sz w:val="20"/>
+          <w:szCs w:val="20"/>
         </w:rPr>
         <w:t xml:space="preserve">Practices:  </w:t>
       </w:r>
@@ -813,24 +813,24 @@
         <w:rPr>
           <w:rFonts w:ascii="Calibri" w:cs="Calibri" w:eastAsia="Calibri" w:hAnsi="Calibri"/>
           <w:color w:val="222222"/>
-          <w:sz w:val="21"/>
-          <w:szCs w:val="21"/>
+          <w:sz w:val="20"/>
+          <w:szCs w:val="20"/>
         </w:rPr>
         <w:t>TDD, SOLID, design patterns, event-driven microservices, saga orchestration, monorepos (Nx), feature flags, cloud-native, Scrum</w:t>
       </w:r>
     </w:p>
     <w:p>
       <w:pPr>
-        <w:spacing w:after="60" w:line="264"/>
-      </w:pPr>
-      <w:r>
-        <w:rPr>
-          <w:rFonts w:ascii="Calibri" w:cs="Calibri" w:eastAsia="Calibri" w:hAnsi="Calibri"/>
-          <w:b/>
-          <w:bCs/>
-          <w:color w:val="1F3864"/>
-          <w:sz w:val="21"/>
-          <w:szCs w:val="21"/>
+        <w:spacing w:after="45" w:line="240"/>
+      </w:pPr>
+      <w:r>
+        <w:rPr>
+          <w:rFonts w:ascii="Calibri" w:cs="Calibri" w:eastAsia="Calibri" w:hAnsi="Calibri"/>
+          <w:b/>
+          <w:bCs/>
+          <w:color w:val="1F3864"/>
+          <w:sz w:val="20"/>
+          <w:szCs w:val="20"/>
         </w:rPr>
         <w:t xml:space="preserve">AI tooling:  </w:t>
       </w:r>
@@ -838,24 +838,24 @@
         <w:rPr>
           <w:rFonts w:ascii="Calibri" w:cs="Calibri" w:eastAsia="Calibri" w:hAnsi="Calibri"/>
           <w:color w:val="222222"/>
-          <w:sz w:val="21"/>
-          <w:szCs w:val="21"/>
+          <w:sz w:val="20"/>
+          <w:szCs w:val="20"/>
         </w:rPr>
         <w:t>AI-assisted development with Claude Code and GitHub Copilot — agentic workflows across the SDLC</w:t>
       </w:r>
     </w:p>
     <w:p>
       <w:pPr>
-        <w:spacing w:after="60" w:line="264"/>
-      </w:pPr>
-      <w:r>
-        <w:rPr>
-          <w:rFonts w:ascii="Calibri" w:cs="Calibri" w:eastAsia="Calibri" w:hAnsi="Calibri"/>
-          <w:b/>
-          <w:bCs/>
-          <w:color w:val="1F3864"/>
-          <w:sz w:val="21"/>
-          <w:szCs w:val="21"/>
+        <w:spacing w:after="45" w:line="240"/>
+      </w:pPr>
+      <w:r>
+        <w:rPr>
+          <w:rFonts w:ascii="Calibri" w:cs="Calibri" w:eastAsia="Calibri" w:hAnsi="Calibri"/>
+          <w:b/>
+          <w:bCs/>
+          <w:color w:val="1F3864"/>
+          <w:sz w:val="20"/>
+          <w:szCs w:val="20"/>
         </w:rPr>
         <w:t xml:space="preserve">Soft skills:  </w:t>
       </w:r>
@@ -863,8 +863,8 @@
         <w:rPr>
           <w:rFonts w:ascii="Calibri" w:cs="Calibri" w:eastAsia="Calibri" w:hAnsi="Calibri"/>
           <w:color w:val="222222"/>
-          <w:sz w:val="21"/>
-          <w:szCs w:val="21"/>
+          <w:sz w:val="20"/>
+          <w:szCs w:val="20"/>
         </w:rPr>
         <w:t xml:space="preserve">Collaboration, mentorship, continuous learning, receptiveness to feedback, positive mindset</w:t>
       </w:r>
@@ -874,7 +874,7 @@
         <w:pBdr>
           <w:bottom w:val="single" w:color="8FAADC" w:sz="8" w:space="2"/>
         </w:pBdr>
-        <w:spacing w:after="120" w:before="260"/>
+        <w:spacing w:after="90" w:before="200"/>
       </w:pPr>
       <w:r>
         <w:rPr>
@@ -893,16 +893,16 @@
         <w:tabs>
           <w:tab w:val="right" w:pos="10080"/>
         </w:tabs>
-        <w:spacing w:after="20" w:before="180"/>
-      </w:pPr>
-      <w:r>
-        <w:rPr>
-          <w:rFonts w:ascii="Calibri" w:cs="Calibri" w:eastAsia="Calibri" w:hAnsi="Calibri"/>
-          <w:b/>
-          <w:bCs/>
-          <w:color w:val="222222"/>
-          <w:sz w:val="23"/>
-          <w:szCs w:val="23"/>
+        <w:spacing w:after="10" w:before="140"/>
+      </w:pPr>
+      <w:r>
+        <w:rPr>
+          <w:rFonts w:ascii="Calibri" w:cs="Calibri" w:eastAsia="Calibri" w:hAnsi="Calibri"/>
+          <w:b/>
+          <w:bCs/>
+          <w:color w:val="222222"/>
+          <w:sz w:val="22"/>
+          <w:szCs w:val="22"/>
         </w:rPr>
         <w:t xml:space="preserve">Systems Engineering (degree in progress)</w:t>
       </w:r>
@@ -910,8 +910,8 @@
         <w:rPr>
           <w:rFonts w:ascii="Calibri" w:cs="Calibri" w:eastAsia="Calibri" w:hAnsi="Calibri"/>
           <w:color w:val="595959"/>
-          <w:sz w:val="23"/>
-          <w:szCs w:val="23"/>
+          <w:sz w:val="22"/>
+          <w:szCs w:val="22"/>
         </w:rPr>
         <w:t xml:space="preserve">  ·  </w:t>
       </w:r>
@@ -921,8 +921,8 @@
           <w:b/>
           <w:bCs/>
           <w:color w:val="1F3864"/>
-          <w:sz w:val="23"/>
-          <w:szCs w:val="23"/>
+          <w:sz w:val="22"/>
+          <w:szCs w:val="22"/>
         </w:rPr>
         <w:t xml:space="preserve">UTN – FRRo</w:t>
       </w:r>
@@ -940,14 +940,14 @@
     </w:p>
     <w:p>
       <w:pPr>
-        <w:spacing w:after="40" w:line="264"/>
-      </w:pPr>
-      <w:r>
-        <w:rPr>
-          <w:rFonts w:ascii="Calibri" w:cs="Calibri" w:eastAsia="Calibri" w:hAnsi="Calibri"/>
-          <w:color w:val="222222"/>
-          <w:sz w:val="21"/>
-          <w:szCs w:val="21"/>
+        <w:spacing w:after="30" w:line="240"/>
+      </w:pPr>
+      <w:r>
+        <w:rPr>
+          <w:rFonts w:ascii="Calibri" w:cs="Calibri" w:eastAsia="Calibri" w:hAnsi="Calibri"/>
+          <w:color w:val="222222"/>
+          <w:sz w:val="20"/>
+          <w:szCs w:val="20"/>
         </w:rPr>
         <w:t xml:space="preserve">Completed coursework for a Systems Engineering degree; two subjects remaining to obtain the degree.</w:t>
       </w:r>
@@ -957,16 +957,16 @@
         <w:tabs>
           <w:tab w:val="right" w:pos="10080"/>
         </w:tabs>
-        <w:spacing w:after="20" w:before="180"/>
-      </w:pPr>
-      <w:r>
-        <w:rPr>
-          <w:rFonts w:ascii="Calibri" w:cs="Calibri" w:eastAsia="Calibri" w:hAnsi="Calibri"/>
-          <w:b/>
-          <w:bCs/>
-          <w:color w:val="222222"/>
-          <w:sz w:val="23"/>
-          <w:szCs w:val="23"/>
+        <w:spacing w:after="10" w:before="140"/>
+      </w:pPr>
+      <w:r>
+        <w:rPr>
+          <w:rFonts w:ascii="Calibri" w:cs="Calibri" w:eastAsia="Calibri" w:hAnsi="Calibri"/>
+          <w:b/>
+          <w:bCs/>
+          <w:color w:val="222222"/>
+          <w:sz w:val="22"/>
+          <w:szCs w:val="22"/>
         </w:rPr>
         <w:t xml:space="preserve">Business-oriented High School Diploma</w:t>
       </w:r>
@@ -974,8 +974,8 @@
         <w:rPr>
           <w:rFonts w:ascii="Calibri" w:cs="Calibri" w:eastAsia="Calibri" w:hAnsi="Calibri"/>
           <w:color w:val="595959"/>
-          <w:sz w:val="23"/>
-          <w:szCs w:val="23"/>
+          <w:sz w:val="22"/>
+          <w:szCs w:val="22"/>
         </w:rPr>
         <w:t xml:space="preserve">  ·  </w:t>
       </w:r>
@@ -985,8 +985,8 @@
           <w:b/>
           <w:bCs/>
           <w:color w:val="1F3864"/>
-          <w:sz w:val="23"/>
-          <w:szCs w:val="23"/>
+          <w:sz w:val="22"/>
+          <w:szCs w:val="22"/>
         </w:rPr>
         <w:t xml:space="preserve">EEM 419</w:t>
       </w:r>
@@ -1007,7 +1007,7 @@
         <w:pBdr>
           <w:bottom w:val="single" w:color="8FAADC" w:sz="8" w:space="2"/>
         </w:pBdr>
-        <w:spacing w:after="120" w:before="260"/>
+        <w:spacing w:after="90" w:before="200"/>
       </w:pPr>
       <w:r>
         <w:rPr>
@@ -1028,14 +1028,14 @@
           <w:ilvl w:val="0"/>
           <w:numId w:val="2"/>
         </w:numPr>
-        <w:spacing w:after="40" w:line="264"/>
-      </w:pPr>
-      <w:r>
-        <w:rPr>
-          <w:rFonts w:ascii="Calibri" w:cs="Calibri" w:eastAsia="Calibri" w:hAnsi="Calibri"/>
-          <w:color w:val="222222"/>
-          <w:sz w:val="21"/>
-          <w:szCs w:val="21"/>
+        <w:spacing w:after="30" w:line="240"/>
+      </w:pPr>
+      <w:r>
+        <w:rPr>
+          <w:rFonts w:ascii="Calibri" w:cs="Calibri" w:eastAsia="Calibri" w:hAnsi="Calibri"/>
+          <w:color w:val="222222"/>
+          <w:sz w:val="20"/>
+          <w:szCs w:val="20"/>
         </w:rPr>
         <w:t xml:space="preserve">Linead Group — Web/mobile platform for medical appointments and a patient-tracking CRM, built with Node.js, Ionic, Angular and Firebase.</w:t>
       </w:r>
@@ -1047,14 +1047,14 @@
           <w:ilvl w:val="0"/>
           <w:numId w:val="2"/>
         </w:numPr>
-        <w:spacing w:after="40" w:line="264"/>
-      </w:pPr>
-      <w:r>
-        <w:rPr>
-          <w:rFonts w:ascii="Calibri" w:cs="Calibri" w:eastAsia="Calibri" w:hAnsi="Calibri"/>
-          <w:color w:val="222222"/>
-          <w:sz w:val="21"/>
-          <w:szCs w:val="21"/>
+        <w:spacing w:after="30" w:line="240"/>
+      </w:pPr>
+      <w:r>
+        <w:rPr>
+          <w:rFonts w:ascii="Calibri" w:cs="Calibri" w:eastAsia="Calibri" w:hAnsi="Calibri"/>
+          <w:color w:val="222222"/>
+          <w:sz w:val="20"/>
+          <w:szCs w:val="20"/>
         </w:rPr>
         <w:t xml:space="preserve">Mountain Stream — Ingredients and raw-material tracking modules using ASP.NET Core MVC, Entity Framework, MediatR, TDD and AngularJS.</w:t>
       </w:r>
@@ -1066,14 +1066,14 @@
           <w:ilvl w:val="0"/>
           <w:numId w:val="2"/>
         </w:numPr>
-        <w:spacing w:after="40" w:line="264"/>
-      </w:pPr>
-      <w:r>
-        <w:rPr>
-          <w:rFonts w:ascii="Calibri" w:cs="Calibri" w:eastAsia="Calibri" w:hAnsi="Calibri"/>
-          <w:color w:val="222222"/>
-          <w:sz w:val="21"/>
-          <w:szCs w:val="21"/>
+        <w:spacing w:after="30" w:line="240"/>
+      </w:pPr>
+      <w:r>
+        <w:rPr>
+          <w:rFonts w:ascii="Calibri" w:cs="Calibri" w:eastAsia="Calibri" w:hAnsi="Calibri"/>
+          <w:color w:val="222222"/>
+          <w:sz w:val="20"/>
+          <w:szCs w:val="20"/>
         </w:rPr>
         <w:t xml:space="preserve">Hoteliga — Payment-integration, reservation-calendar and identity/security modules for a hotel-management platform using ASP.NET (Core) MVC and AngularJS.</w:t>
       </w:r>
@@ -1083,7 +1083,7 @@
         <w:pBdr>
           <w:bottom w:val="single" w:color="8FAADC" w:sz="8" w:space="2"/>
         </w:pBdr>
-        <w:spacing w:after="120" w:before="260"/>
+        <w:spacing w:after="90" w:before="200"/>
       </w:pPr>
       <w:r>
         <w:rPr>
@@ -1099,16 +1099,16 @@
     </w:p>
     <w:p>
       <w:pPr>
-        <w:spacing w:after="60" w:line="264"/>
-      </w:pPr>
-      <w:r>
-        <w:rPr>
-          <w:rFonts w:ascii="Calibri" w:cs="Calibri" w:eastAsia="Calibri" w:hAnsi="Calibri"/>
-          <w:b/>
-          <w:bCs/>
-          <w:color w:val="1F3864"/>
-          <w:sz w:val="21"/>
-          <w:szCs w:val="21"/>
+        <w:spacing w:after="45" w:line="240"/>
+      </w:pPr>
+      <w:r>
+        <w:rPr>
+          <w:rFonts w:ascii="Calibri" w:cs="Calibri" w:eastAsia="Calibri" w:hAnsi="Calibri"/>
+          <w:b/>
+          <w:bCs/>
+          <w:color w:val="1F3864"/>
+          <w:sz w:val="20"/>
+          <w:szCs w:val="20"/>
         </w:rPr>
         <w:t xml:space="preserve">Languages:  </w:t>
       </w:r>
@@ -1116,8 +1116,8 @@
         <w:rPr>
           <w:rFonts w:ascii="Calibri" w:cs="Calibri" w:eastAsia="Calibri" w:hAnsi="Calibri"/>
           <w:color w:val="222222"/>
-          <w:sz w:val="21"/>
-          <w:szCs w:val="21"/>
+          <w:sz w:val="20"/>
+          <w:szCs w:val="20"/>
         </w:rPr>
         <w:t xml:space="preserve">Spanish (native), English (professional working proficiency — preparing for B2 First)</w:t>
       </w:r>
@@ -1129,14 +1129,14 @@
           <w:ilvl w:val="0"/>
           <w:numId w:val="2"/>
         </w:numPr>
-        <w:spacing w:after="40" w:line="264"/>
-      </w:pPr>
-      <w:r>
-        <w:rPr>
-          <w:rFonts w:ascii="Calibri" w:cs="Calibri" w:eastAsia="Calibri" w:hAnsi="Calibri"/>
-          <w:color w:val="222222"/>
-          <w:sz w:val="21"/>
-          <w:szCs w:val="21"/>
+        <w:spacing w:after="30" w:line="240"/>
+      </w:pPr>
+      <w:r>
+        <w:rPr>
+          <w:rFonts w:ascii="Calibri" w:cs="Calibri" w:eastAsia="Calibri" w:hAnsi="Calibri"/>
+          <w:color w:val="222222"/>
+          <w:sz w:val="20"/>
+          <w:szCs w:val="20"/>
         </w:rPr>
         <w:t xml:space="preserve">Participated in several Model UN simulations as Ambassador and General Congress member.</w:t>
       </w:r>
@@ -1148,21 +1148,21 @@
           <w:ilvl w:val="0"/>
           <w:numId w:val="2"/>
         </w:numPr>
-        <w:spacing w:after="40" w:line="264"/>
-      </w:pPr>
-      <w:r>
-        <w:rPr>
-          <w:rFonts w:ascii="Calibri" w:cs="Calibri" w:eastAsia="Calibri" w:hAnsi="Calibri"/>
-          <w:color w:val="222222"/>
-          <w:sz w:val="21"/>
-          <w:szCs w:val="21"/>
+        <w:spacing w:after="30" w:line="240"/>
+      </w:pPr>
+      <w:r>
+        <w:rPr>
+          <w:rFonts w:ascii="Calibri" w:cs="Calibri" w:eastAsia="Calibri" w:hAnsi="Calibri"/>
+          <w:color w:val="222222"/>
+          <w:sz w:val="20"/>
+          <w:szCs w:val="20"/>
         </w:rPr>
         <w:t xml:space="preserve">Developed multiple side projects as an entrepreneur, exploring new technologies and methodologies hands-on.</w:t>
       </w:r>
     </w:p>
     <w:sectPr>
       <w:pgSz w:w="12240" w:h="15840" w:orient="portrait"/>
-      <w:pgMar w:top="1080" w:right="1080" w:bottom="1080" w:left="1080" w:header="708" w:footer="708" w:gutter="0"/>
+      <w:pgMar w:top="648" w:right="1080" w:bottom="648" w:left="1080" w:header="708" w:footer="708" w:gutter="0"/>
       <w:pgNumType/>
       <w:docGrid w:linePitch="360"/>
     </w:sectPr>

</xml_diff>

<commit_message>
Update CV and site to reflect leaving Viirtue
Cap the Viirtue employment dates at Jul 2026 instead of "Present" and
shift the handful of present-tense framing sentences (summaries, hero
lede) to past tense, across both CV docx/PDF variants and the bilingual
website. Achievement bullets were already written in past tense and
needed no changes. Also drop the now-stale worksFor claim from the
site's JSON-LD structured data.

Co-Authored-By: Claude Sonnet 5 <noreply@anthropic.com>
</commit_message>
<xml_diff>
--- a/docs/CV_Julian_Giovanelli_SoftwareEngineer.docx
+++ b/docs/CV_Julian_Giovanelli_SoftwareEngineer.docx
@@ -130,7 +130,7 @@
           <w:sz w:val="20"/>
           <w:szCs w:val="20"/>
         </w:rPr>
-        <w:t>Full-stack software engineer with 9+ years building scalable, maintainable web applications — currently Tech Lead for ViiBE, Viirtue’s white-label quote-to-cash platform, embedding directly with the team as a hands-on contributor while also owning the product side of delivery: defining requirements, process and quality discipline, and evolving that process through the shift to agentic AI-assisted development. One of the top contributors to its 40+ microservice codebase, having rebuilt the billing engine now processing close to $1M in monthly recurring revenue across 3,000+ accounts, contributing to a $10M Series A. Deep experience across .NET, Angular and Node.js: designing billing, quoting, taxation and payment systems, integrating third-party and AI services, and operating event-driven, cloud-native microservices on GCP (GKE / Kubernetes). Works AI-first with agentic tools like Claude Code across the development lifecycle. Passionate about clean architecture, TDD and continuous learning.</w:t>
+        <w:t>Full-stack software engineer with 9+ years building scalable, maintainable web applications — most recently Tech Lead for ViiBE, Viirtue’s white-label quote-to-cash platform, embedding directly with the team as a hands-on contributor while also owning the product side of delivery: defining requirements, process and quality discipline, and evolving that process through the shift to agentic AI-assisted development. One of the top contributors to its 40+ microservice codebase, having rebuilt the billing engine now processing close to $1M in monthly recurring revenue across 3,000+ accounts, contributing to a $10M Series A. Deep experience across .NET, Angular and Node.js: designing billing, quoting, taxation and payment systems, integrating third-party and AI services, and operating event-driven, cloud-native microservices on GCP (GKE / Kubernetes). Worked AI-first with agentic tools like Claude Code across the development lifecycle. Passionate about clean architecture, TDD and continuous learning.</w:t>
       </w:r>
     </w:p>
     <w:p>
@@ -199,7 +199,8 @@
           <w:sz w:val="20"/>
           <w:szCs w:val="20"/>
         </w:rPr>
-        <w:t xml:space="preserve">	Jan 2022 – Present</w:t>
+        <w:tab/>
+        <w:t>Jan 2022 – Jul 2026</w:t>
       </w:r>
     </w:p>
     <w:p>
@@ -370,7 +371,7 @@
           <w:sz w:val="20"/>
           <w:szCs w:val="20"/>
         </w:rPr>
-        <w:t>As Tech Lead (since Nov 2023), led a cross-functional team of up to 12 engineers, defining the team’s delivery process and quality discipline — and adapting it for agentic AI-assisted workflows — while mentoring teammates and continuing to contribute hands-on across the platform.</w:t>
+        <w:t>As Tech Lead (Nov 2023 – Jul 2026), led a cross-functional team of up to 12 engineers, defining the team’s delivery process and quality discipline — and adapting it for agentic AI-assisted workflows — while mentoring teammates and continuing to contribute hands-on across the platform.</w:t>
       </w:r>
     </w:p>
     <w:p>

</xml_diff>